<commit_message>
docs: require matched Stage D no-contact control
</commit_message>
<xml_diff>
--- a/research_records/reports/G20260924_smpl_vposer_shared_beta_v1_mainline_record.docx
+++ b/research_records/reports/G20260924_smpl_vposer_shared_beta_v1_mainline_record.docx
@@ -2077,6 +2077,9 @@
         </w:rPr>
         <w:t>hand-only 和 foot+hand 的主指标与 foot-only 几乎一致。hand-only Stage D 的 hand loss 数值约 0.000309，乘以 0.01 后对总目标的贡献很小；结果张量相对 foot-only 只有约 10^-6 量级的变化。当前不能据此声称手部项已经改善拟合。</w:t>
       </w:r>
+      <w:r>
+        <w:t xml:space="preserve"> 现有 no-contact 只到 Stage C，而三条接触路线另跑了 80 步 Stage D；因此当前表中接触路线相对 no-contact 的变化不能归因于接触项。下一次对照必须增加同样 80 步的 Stage D 零接触控制。</w:t>
+      </w:r>
     </w:p>
     <w:p>
       <w:pPr>
@@ -2151,6 +2154,9 @@
           <w:sz w:val="21"/>
         </w:rPr>
         <w:t>下一步固定窗口 60..90、输入、初始化、优化步数和 Stage A/B/C，唯一变量改为全帧手部表面损失权重。执行 prompt 已保存为：</w:t>
+      </w:r>
+      <w:r>
+        <w:t xml:space="preserve"> 另需补做 Stage D 零接触、相同 80 步的控制路线，作为所有手部权重效果的主对照。</w:t>
       </w:r>
     </w:p>
     <w:p>

</xml_diff>

<commit_message>
feat: visualize surface contact SMPL fit
</commit_message>
<xml_diff>
--- a/research_records/reports/G20260924_smpl_vposer_shared_beta_v1_mainline_record.docx
+++ b/research_records/reports/G20260924_smpl_vposer_shared_beta_v1_mainline_record.docx
@@ -2711,6 +2711,70 @@
         <w:t>当前全帧手部损失已经进入计算图，但权重 0.01 下没有产生可分辨的拟合变化。下一步只做固定窗口手部权重敏感性对照。</w:t>
       </w:r>
     </w:p>
+    <w:p>
+      <w:pPr>
+        <w:pStyle w:val="Heading1"/>
+      </w:pPr>
+      <w:r>
+        <w:t>十、手脚接触拟合结果与可视化</w:t>
+      </w:r>
+    </w:p>
+    <w:p>
+      <w:pPr>
+        <w:spacing w:line="324" w:lineRule="auto"/>
+      </w:pPr>
+      <w:r>
+        <w:t>本次可视化使用 `surface_contact_window60_90_v4_foot_hand_w010` 的 Stage D 结果，参数为 surface foot weight=0.02、全帧 surface hand weight=0.10，窗口为原始帧 60..90，共 31 帧。页面没有重新拟合，也没有读取旧动态地面或旧助步器位姿。</w:t>
+      </w:r>
+    </w:p>
+    <w:p>
+      <w:pPr>
+        <w:spacing w:line="324" w:lineRule="auto"/>
+      </w:pPr>
+      <w:r>
+        <w:t>页面输出为 `surface_contact_window60_90_v4_foot_hand_w010/surface_contact_grounded_viewer.html`，同时保存 `result_grounded.npz`。页面每帧显示 SMPL 6890 顶点和 13776 个真实三角面、模型 COCO-17、accepted 三角化点、人体骨架、当前地面变换下的助步器、左右扶手 capsule、左右 sole/palm 候选点、Stage 和 surface residual。显示坐标采用 [X_display,Y_display,Z_display]=[X_ground,-Y_ground,Z_ground]，播放按 30 FPS 逐帧推进，不插值。</w:t>
+      </w:r>
+    </w:p>
+    <w:p>
+      <w:pPr>
+        <w:spacing w:line="324" w:lineRule="auto"/>
+      </w:pPr>
+      <w:r>
+        <w:t>拟合入口实际优化目标为：L=L_3D+0.10L_2D+0.02L_VPoser+I_D(λ_f L_foot+λ_h L_hand)+I_{A/B/C}(0.02L_beta)。其中，L_3D=Σ w_3 ρ_delta(||J_COCO−X_tri||_2)/(Σw_3+ε)，delta=0.10 m；L_2D=Σ w[ρ_20(||π_left(J_COCO)−u_left||_2)+ρ_20(||π_right(J_COCO)−u_right||_2)]/[2Σ(w·valid_2D)+ε]；ρ_delta(x)=delta²(sqrt(1+(x/delta)²)−1)。</w:t>
+      </w:r>
+    </w:p>
+    <w:p>
+      <w:pPr>
+        <w:spacing w:line="324" w:lineRule="auto"/>
+      </w:pPr>
+      <w:r>
+        <w:t>手部表面项对每帧两只手分别计算 palm vertices 到对应扶手线段 capsule 的 residual：r=||p−(a+clamp(((p−a)·(b−a))/||b−a||²,0,1)(b−a))||−r_handle，r_handle=0.016 m。每帧 hand loss 使用 residual 的 soft-min 和 pseudo-Huber，再对 31 帧×2 只手均匀平均；本路线不使用 hand_contact_weight、hand_label 或 COCO wrist。</w:t>
+      </w:r>
+    </w:p>
+    <w:p>
+      <w:pPr>
+        <w:spacing w:line="324" w:lineRule="auto"/>
+      </w:pPr>
+      <w:r>
+        <w:t>脚部表面项取左右各 54 个 sole vertices 的地面 z 值。每只脚先对 54 个 z 值做 soft-min，再加 0.25 倍穿透平方项；左右脚按当前 foot_contact_weight 加权归一化。surface foot+hand 路线的 lambda_f=0.02、lambda_h=0.10。</w:t>
+      </w:r>
+    </w:p>
+    <w:p>
+      <w:pPr>
+        <w:spacing w:line="324" w:lineRule="auto"/>
+      </w:pPr>
+      <w:r>
+        <w:t>优化分四段。Stage A 固定 beta=0，使用 Adam，latent/root 学习率 0.01，translation 学习率 0.003，120 步；Stage B 冻结每帧 motion，只优化共享 beta，学习率 0.0005，120 步；Stage C 重新优化 latent/root/beta，学习率分别为 0.003、0.001、0.0003，120 步；Stage D 从 Stage C 同一进程内存继续，冻结 beta，只优化 latent/root/translation，学习率 0.001、0.0005，80 步。每步对优化器参数做 max norm=10 的梯度裁剪。</w:t>
+      </w:r>
+    </w:p>
+    <w:p>
+      <w:pPr>
+        <w:spacing w:line="324" w:lineRule="auto"/>
+      </w:pPr>
+      <w:r>
+        <w:t>当前页面展示的是已接入手脚表面项的工程拟合结果。v4 权重扫描显示 hand weight 从 0.03 增至 0.10 时主指标和手部 residual 没有形成可观测单调变化，因此页面展示的是接入结果，不把画面中的靠近扶手或地面解释为真实握持、触地或承重。</w:t>
+      </w:r>
+    </w:p>
     <w:sectPr>
       <w:footerReference w:type="default" r:id="rId9"/>
       <w:pgSz w:w="12240" w:h="15840"/>

</xml_diff>

<commit_message>
docs: update SMPL contact mainline record
</commit_message>
<xml_diff>
--- a/research_records/reports/G20260924_smpl_vposer_shared_beta_v1_mainline_record.docx
+++ b/research_records/reports/G20260924_smpl_vposer_shared_beta_v1_mainline_record.docx
@@ -1,6 +1,6 @@
 
 <file path=word/document.xml><?xml version="1.0" encoding="utf-8"?>
-<w:document xmlns:wpc="http://schemas.microsoft.com/office/word/2010/wordprocessingCanvas" xmlns:mo="http://schemas.microsoft.com/office/mac/office/2008/main" xmlns:mc="http://schemas.openxmlformats.org/markup-compatibility/2006" xmlns:mv="urn:schemas-microsoft-com:mac:vml" xmlns:o="urn:schemas-microsoft-com:office:office" xmlns:r="http://schemas.openxmlformats.org/officeDocument/2006/relationships" xmlns:m="http://schemas.openxmlformats.org/officeDocument/2006/math" xmlns:v="urn:schemas-microsoft-com:vml" xmlns:wp14="http://schemas.microsoft.com/office/word/2010/wordprocessingDrawing" xmlns:wp="http://schemas.openxmlformats.org/drawingml/2006/wordprocessingDrawing" xmlns:w10="urn:schemas-microsoft-com:office:word" xmlns:w="http://schemas.openxmlformats.org/wordprocessingml/2006/main" xmlns:w14="http://schemas.microsoft.com/office/word/2010/wordml" xmlns:wpg="http://schemas.microsoft.com/office/word/2010/wordprocessingGroup" xmlns:wpi="http://schemas.microsoft.com/office/word/2010/wordprocessingInk" xmlns:wne="http://schemas.microsoft.com/office/word/2006/wordml" xmlns:wps="http://schemas.microsoft.com/office/word/2010/wordprocessingShape" mc:Ignorable="w14 wp14">
+<w:document xmlns:ns1="http://schemas.openxmlformats.org/markup-compatibility/2006" xmlns:ns2="http://schemas.openxmlformats.org/officeDocument/2006/relationships" xmlns:w="http://schemas.openxmlformats.org/wordprocessingml/2006/main" ns1:Ignorable="w14 wp14">
   <w:body>
     <w:p>
       <w:pPr>
@@ -59,7 +59,7 @@
           <w:b w:val="0"/>
           <w:sz w:val="21"/>
         </w:rPr>
-        <w:t>窗口 60..90 的 surface foot-only 相对 no-contact：二维 P95 由 140.330 px 变为 134.274 px，三维 P95 由 172.296 mm 变为 170.105 mm；全帧 hand surface loss 已接入，但在权重 0.01 下对主指标影响接近零。</w:t>
+        <w:t>窗口 60..90 的 v6 对照先发现脚部残差门判定公式错误：原先直接比较负的有符号中位数，把向零移动误判为恶化。改用绝对残差后，foot_a1 的脚部绝对中位残差由 32.9434 mm 降至 30.0938 mm，改善 8.6501%；原 v6 comparison 保留为历史记录，更正写入独立 gate reaudit。</w:t>
       </w:r>
     </w:p>
     <w:p>
@@ -2075,10 +2075,10 @@
           <w:b w:val="0"/>
           <w:sz w:val="21"/>
         </w:rPr>
-        <w:t>hand-only 和 foot+hand 的主指标与 foot-only 几乎一致。hand-only Stage D 的 hand loss 数值约 0.000309，乘以 0.01 后对总目标的贡献很小；结果张量相对 foot-only 只有约 10^-6 量级的变化。当前不能据此声称手部项已经改善拟合。</w:t>
+        <w:t>v5 梯度审计显示 surface loss 的图构建正确，但表面项相对观测项的梯度偏弱；v6 将 Stage C 的观测系数改为 3D=1.0、2D=0.20，使 3D 梯度目标略高于 2D，Stage D 使用 3D=0.70、2D=0.020。v6 六路线均完成，但 hand 路线没有同时满足残差、穿透和主观测门。脚部路线的原始 gate 汇总有符号残差公式错误，已单独更正，因此不能继续引用“无路线通过”作为当前结论。</w:t>
       </w:r>
       <w:r>
-        <w:t xml:space="preserve"> 现有 no-contact 只到 Stage C，而三条接触路线另跑了 80 步 Stage D；因此当前表中接触路线相对 no-contact 的变化不能归因于接触项。下一次对照必须增加同样 80 步的 Stage D 零接触控制。</w:t>
+        <w:t xml:space="preserve"/>
       </w:r>
     </w:p>
     <w:p>
@@ -2153,10 +2153,10 @@
           <w:b w:val="0"/>
           <w:sz w:val="21"/>
         </w:rPr>
-        <w:t>下一步固定窗口 60..90、输入、初始化、优化步数和 Stage A/B/C，唯一变量改为全帧手部表面损失权重。执行 prompt 已保存为：</w:t>
+        <w:t>下一步不再继续放大手部权重，也不在开发窗口内挑选最优路线。使用已冻结的 foot_a1（脚权重 1.0，手权重 0）在 129..159、278..308、373..403 三个独立窗口分别运行 no-contact 控制和 foot_a1，共六条路线。每个窗口都比较 3D/2D P95、脚部绝对残差向零改善、左右穿透比例、beta 冻结、梯度隔离和有限性；三个窗口全部通过后才允许冻结 foot_a1。执行指令：dispatch/task-13-validate-foot-a1-independent-windows.md。</w:t>
       </w:r>
       <w:r>
-        <w:t xml:space="preserve"> 另需补做 Stage D 零接触、相同 80 步的控制路线，作为所有手部权重效果的主对照。</w:t>
+        <w:t xml:space="preserve"/>
       </w:r>
     </w:p>
     <w:p>
@@ -2170,7 +2170,7 @@
           <w:b w:val="0"/>
           <w:sz w:val="21"/>
         </w:rPr>
-        <w:t>dispatch/task-07-surface-hand-weight-sweep.md</w:t>
+        <w:t>dispatch/task-13-validate-foot-a1-independent-windows.md</w:t>
       </w:r>
     </w:p>
     <w:tbl>
@@ -2694,7 +2694,7 @@
           <w:b w:val="0"/>
           <w:sz w:val="21"/>
         </w:rPr>
-        <w:t>从原始双目 PMPose 到 male SMPL 表面脚手损失的完整工程主线已经跑通，表面梯度隔离和 Stage C→D beta 冻结审计通过。</w:t>
+        <w:t>从原始双目 PMPose、原始鱼眼三角化、当前 Stage 1/2 和地面变换，到 male SMPL、共享 beta、Stage C→D 和表面手脚损失的工程链条已经跑通；表面梯度隔离、beta 冻结和同进程审计通过。</w:t>
       </w:r>
     </w:p>
     <w:p>
@@ -2708,7 +2708,7 @@
           <w:b w:val="0"/>
           <w:sz w:val="21"/>
         </w:rPr>
-        <w:t>当前全帧手部损失已经进入计算图，但权重 0.01 下没有产生可分辨的拟合变化。下一步只做固定窗口手部权重敏感性对照。</w:t>
+        <w:t>当前全帧手部损失已进入计算图，但 v5/v6 均未形成同时满足主观测和穿透门的候选。脚部 foot_a1 只在开发窗口通过更正后的门，仍需独立窗口验证。所有结论仍是 engineering validation。</w:t>
       </w:r>
     </w:p>
     <w:p>
@@ -2724,7 +2724,7 @@
         <w:spacing w:line="324" w:lineRule="auto"/>
       </w:pPr>
       <w:r>
-        <w:t>本次可视化使用 `surface_contact_window60_90_v4_foot_hand_w010` 的 Stage D 结果，参数为 surface foot weight=0.02、全帧 surface hand weight=0.10，窗口为原始帧 60..90，共 31 帧。页面没有重新拟合，也没有读取旧动态地面或旧助步器位姿。</w:t>
+        <w:t>主线中已有的接触可视化使用窗口 60..90 的 Stage D 输出；v6 系数审计对应 Stage C 观测 3D=1.0、2D=0.20，Stage D 观测缩放 3D=0.70、2D=0.020。可视化只显示当前运行输出，不反向修改拟合，也不读取旧逐帧接触目标或旧助步器位姿。</w:t>
       </w:r>
     </w:p>
     <w:p>
@@ -2756,7 +2756,7 @@
         <w:spacing w:line="324" w:lineRule="auto"/>
       </w:pPr>
       <w:r>
-        <w:t>脚部表面项取左右各 54 个 sole vertices 的地面 z 值。每只脚先对 54 个 z 值做 soft-min，再加 0.25 倍穿透平方项；左右脚按当前 foot_contact_weight 加权归一化。surface foot+hand 路线的 lambda_f=0.02、lambda_h=0.10。</w:t>
+        <w:t>脚部表面项取左右各 54 个 sole vertices 的地面 z 值。每只脚先使用中心化 soft-min，再加入 penetration_weight=1.0 的 ReLU 穿透惩罚，避免脚底穿入地面而不受惩罚；左右脚按当前权重归一化。v6 开发候选 foot_a1 使用 foot coefficient=1.0、hand coefficient=0；该候选尚未跨窗口冻结。</w:t>
       </w:r>
     </w:p>
     <w:p>
@@ -2772,11 +2772,97 @@
         <w:spacing w:line="324" w:lineRule="auto"/>
       </w:pPr>
       <w:r>
-        <w:t>当前页面展示的是已接入手脚表面项的工程拟合结果。v4 权重扫描显示 hand weight 从 0.03 增至 0.10 时主指标和手部 residual 没有形成可观测单调变化，因此页面展示的是接入结果，不把画面中的靠近扶手或地面解释为真实握持、触地或承重。</w:t>
+        <w:t>当前页面展示的是已接入表面项的 engineering validation 结果。v5/v6 权重与梯度审计表明，接触项对优化的影响仍受几何和尺度限制；foot_a1 仅在开发窗口通过更正后的数值门。画面中的靠近扶手、靠近地面或网格穿透都不能解释为真实握持、触地、承重或真实三维精度。</w:t>
+      </w:r>
+    </w:p>
+    <w:p>
+      <w:pPr>
+        <w:pStyle w:val="Heading1"/>
+      </w:pPr>
+      <w:r>
+        <w:t xml:space="preserve">十一、已完成修正与当前正式主线</w:t>
+      </w:r>
+    </w:p>
+    <w:p>
+      <w:pPr>
+        <w:pStyle w:val="Heading2"/>
+      </w:pPr>
+      <w:r>
+        <w:t xml:space="preserve">11.1 损失函数的方向与穿透处理</w:t>
+      </w:r>
+    </w:p>
+    <w:p>
+      <w:r>
+        <w:t xml:space="preserve">脚部和手部表面损失都保留带符号的几何 residual，用于区分位于目标表面外侧和穿透目标的情况；优化项不是简单取绝对值。脚部 residual 是 sole 顶点到地面平面的有符号高度，手部 residual 是 palm 顶点到扶手 capsule 中心线距离减去扶手半径。两类损失均使用中心化 soft-min 聚合候选点，并对负 residual 额外加入 ReLU 穿透惩罚。这样既保留接近目标表面的方向信息，又不会让穿透被无符号距离掩盖。</w:t>
+      </w:r>
+    </w:p>
+    <w:p>
+      <w:pPr>
+        <w:pStyle w:val="Heading2"/>
+      </w:pPr>
+      <w:r>
+        <w:t xml:space="preserve">11.2 分阶段观测与接触优化</w:t>
+      </w:r>
+    </w:p>
+    <w:p>
+      <w:r>
+        <w:t xml:space="preserve">Stage A 以 beta=0 拟合逐帧姿态和根部变量；Stage B 只优化全窗口共享 beta；Stage C 联合微调姿态、根部变量和共享 beta，三阶段都不使用接触损失。Stage D 从同一进程的 Stage C 内存继续，冻结 beta，只优化 VPoser latent、global orientation 和 translation，才加入表面接触项。当前观测系数为 Stage C 的 3D=1.0、2D=0.20，Stage D 的 3D=0.70、2D=0.020；接触系数只乘归一化后的脚部和手部表面项。</w:t>
+      </w:r>
+    </w:p>
+    <w:p>
+      <w:pPr>
+        <w:pStyle w:val="Heading2"/>
+      </w:pPr>
+      <w:r>
+        <w:t xml:space="preserve">11.3 手部接触的正式口径</w:t>
+      </w:r>
+    </w:p>
+    <w:p>
+      <w:r>
+        <w:t xml:space="preserve">手部不依赖手部接触标签。所有窗口帧、左右手都计算 778 个 palm 候选顶点到对应动态扶手 capsule 的表面 residual，均匀平均进入 hand surface loss。hand_contact_weight、hand_label 和 hand_candidate_score 仅保留为输入审计字段，不能关闭手部损失。该“全帧都有手部接触项”是当前拟合模型的工程假设，不是对真实握持的判定。</w:t>
+      </w:r>
+    </w:p>
+    <w:p>
+      <w:pPr>
+        <w:pStyle w:val="Heading2"/>
+      </w:pPr>
+      <w:r>
+        <w:t xml:space="preserve">11.4 v6 判定错误的正式更正</w:t>
+      </w:r>
+    </w:p>
+    <w:p>
+      <w:r>
+        <w:t xml:space="preserve">v6 原汇总用有符号脚部中位 residual 直接计算改善比例，导致向零移动被误判。更正后，foot_a1 在窗口 60..90 的脚部绝对中位 residual 从 32.9434 mm 降到 30.0938 mm，改善 8.6501%；其 3D P95 增加 1.61%，2D P95 改善 1.58 px，穿透比例未增加，beta 和梯度审计均通过。因此 foot_a1 是开发窗口候选，但不是已经冻结的正式系数。</w:t>
+      </w:r>
+    </w:p>
+    <w:p>
+      <w:pPr>
+        <w:pStyle w:val="Heading2"/>
+      </w:pPr>
+      <w:r>
+        <w:t xml:space="preserve">11.5 当前未解决问题与下一步</w:t>
+      </w:r>
+    </w:p>
+    <w:p>
+      <w:r>
+        <w:t xml:space="preserve">当前仍未解决的是：SMPL sole 点在地面系中大比例低于地面；手部路线尚未同时通过残差、穿透和主观测门；v6 的 60..90 窗口不能代表跨时段稳定性。下一步使用 foot_a1，在 129..159、278..308、373..403 三个独立窗口各运行 no-contact 控制和 foot_a1，保持输入、初始化、步数和所有观测系数不变。只有三个窗口都通过预先定义的 3D、2D、脚部绝对 residual、穿透比例、beta 冻结、梯度隔离和有限性门，才把 foot_a1 写入冻结主线；否则停止接触系数选择并回到几何/坐标或优化尺度审查。</w:t>
+      </w:r>
+    </w:p>
+    <w:p>
+      <w:pPr>
+        <w:pStyle w:val="Heading2"/>
+      </w:pPr>
+      <w:r>
+        <w:t xml:space="preserve">11.6 结论边界</w:t>
+      </w:r>
+    </w:p>
+    <w:p>
+      <w:r>
+        <w:t xml:space="preserve">以上修正解决的是损失方向、穿透惩罚、分阶段权重口径和 v6 数值门判定问题；它们没有提供人工接触标签、物理触觉、握力、承重或独立三维真值。因此当前所有结果仍只能称为 engineering validation。</w:t>
       </w:r>
     </w:p>
     <w:sectPr>
-      <w:footerReference w:type="default" r:id="rId9"/>
+      <w:footerReference w:type="default" ns2:id="rId9"/>
       <w:pgSz w:w="12240" w:h="15840"/>
       <w:pgMar w:top="1247" w:right="1417" w:bottom="1247" w:left="1417" w:header="720" w:footer="720" w:gutter="0"/>
       <w:cols w:space="720"/>

</xml_diff>